<commit_message>
Add bonus analysis (temporal features, subset comparison, PCA/UMAP) to code, report and slides
Co-Authored-By: Claude Sonnet 5.5 <noreply@anthropic.com>
</commit_message>
<xml_diff>
--- a/report/report.docx
+++ b/report/report.docx
@@ -1052,6 +1052,75 @@
         <w:t>Lưu ý khi áp dụng: nhiều tín hiệu mạnh xuất hiện vì gần định nghĩa nhãn. Cần thử lại trên dữ liệu với cửa sổ thời gian tách rời giữa quan sát và dự báo để xác nhận giá trị dự báo.</w:t>
       </w:r>
     </w:p>
+    <w:p>
+      <w:r>
+        <w:t>Từ phần bonus: theo dõi người dùng có xu hướng nghe giảm mạnh hoặc im lặng quá 7 ngày như cảnh báo sớm, và gửi nhắc nhở hoặc gợi ý nhạc trước khi tới hạn gia hạn.</w:t>
+      </w:r>
+    </w:p>
+    <w:p>
+      <w:pPr>
+        <w:pStyle w:val="Heading1"/>
+      </w:pPr>
+      <w:r>
+        <w:t>8. Bonus – Advanced Techniques</w:t>
+      </w:r>
+    </w:p>
+    <w:p>
+      <w:r>
+        <w:t>Feature engineering theo thời gian (pattern theo chuỗi ngày): từ log hằng ngày của tháng 3/2017 tạo hai biến: xu hướng nghe (log tổng số giây 10 ngày cuối trừ 10 ngày đầu) và số ngày kể từ lần nghe cuối. Đây là pattern theo thời gian đơn giản, không phải khai phá chuỗi tuần tự đầy đủ.</w:t>
+      </w:r>
+    </w:p>
+    <w:p>
+      <w:r>
+        <w:t>Phát hiện: người có xu hướng nghe giảm mạnh churn 77,3% (29.867 người) so với 34,1% ở nhóm tăng mạnh. Người không nghe 15 ngày trở lên churn 82,0%, so với 37,3% ở nhóm nghe trong 1 ngày gần nhất. Hai biến mới đưa ROC-AUC của mô hình chỉ dùng nghe và hồ sơ từ 0,680 lên 0,743, cho thấy sự suy giảm hoạt động là tín hiệu cảnh báo sớm hữu ích hơn mức nghe tuyệt đối.</w:t>
+      </w:r>
+    </w:p>
+    <w:p>
+      <w:r>
+        <w:t>So sánh giữa các tập con: mô hình hành vi phân biệt tốt nhất ở kênh 7 (AUC 0,826, churn 29%) và người mới dưới 1 năm (0,798); kém hơn ở người gắn bó từ 4 năm (0,684) và kênh 9 (0,714). Nghĩa là với người dùng lâu năm, hành vi nghe nói ít về việc họ có rời đi hay không.</w:t>
+      </w:r>
+    </w:p>
+    <w:p>
+      <w:r>
+        <w:t>Giảm chiều: PCA 5 thành phần giải thích 58%, 11%, 9%, 8%, 7% phương sai (thành phần đầu thống trị, chủ yếu là cường độ nghe). UMAP (hình dưới) cho thấy churn và không churn trộn lẫn trong khối chính, chỉ tách nhẹ ở rìa. Điều này khớp với AUC vừa phải: hành vi nghe đơn lẻ không tách được churn, nên cần kết hợp tín hiệu giao dịch và xu hướng.</w:t>
+      </w:r>
+    </w:p>
+    <w:p>
+      <w:r>
+        <w:drawing>
+          <wp:inline xmlns:a="http://schemas.openxmlformats.org/drawingml/2006/main" xmlns:pic="http://schemas.openxmlformats.org/drawingml/2006/picture">
+            <wp:extent cx="5029200" cy="4310743"/>
+            <wp:docPr id="4" name="Picture 4"/>
+            <wp:cNvGraphicFramePr>
+              <a:graphicFrameLocks noChangeAspect="1"/>
+            </wp:cNvGraphicFramePr>
+            <a:graphic>
+              <a:graphicData uri="http://schemas.openxmlformats.org/drawingml/2006/picture">
+                <pic:pic>
+                  <pic:nvPicPr>
+                    <pic:cNvPr id="0" name="umap_churn.png"/>
+                    <pic:cNvPicPr/>
+                  </pic:nvPicPr>
+                  <pic:blipFill>
+                    <a:blip r:embed="rId12"/>
+                    <a:stretch>
+                      <a:fillRect/>
+                    </a:stretch>
+                  </pic:blipFill>
+                  <pic:spPr>
+                    <a:xfrm>
+                      <a:off x="0" y="0"/>
+                      <a:ext cx="5029200" cy="4310743"/>
+                    </a:xfrm>
+                    <a:prstGeom prst="rect"/>
+                  </pic:spPr>
+                </pic:pic>
+              </a:graphicData>
+            </a:graphic>
+          </wp:inline>
+        </w:drawing>
+      </w:r>
+    </w:p>
     <w:sectPr>
       <w:pgSz w:w="12240" w:h="15840"/>
       <w:pgMar w:top="1440" w:right="1800" w:bottom="1440" w:left="1800" w:header="720" w:footer="720" w:gutter="0"/>

</xml_diff>